<commit_message>
include case id, change language to da
</commit_message>
<xml_diff>
--- a/trafik_info_template.docx
+++ b/trafik_info_template.docx
@@ -131,8 +131,7 @@
       </w:pPr>
       <w:r>
         <w:rPr>
-          <w:noProof/>
-          <w:lang w:val="da-DK" w:eastAsia="da-DK"/>
+          <w:lang w:eastAsia="da-DK"/>
         </w:rPr>
         <w:drawing>
           <wp:anchor distT="0" distB="0" distL="0" distR="0" simplePos="0" relativeHeight="251660288" behindDoc="0" locked="0" layoutInCell="1" allowOverlap="1" wp14:anchorId="6663CDB2" wp14:editId="7BB7F087">
@@ -193,7 +192,6 @@
           <w:color w:val="FF0000"/>
           <w:sz w:val="28"/>
           <w:szCs w:val="28"/>
-          <w:lang w:val="da-DK"/>
         </w:rPr>
       </w:pPr>
       <w:r>
@@ -203,7 +201,6 @@
           <w:color w:val="FF0000"/>
           <w:sz w:val="28"/>
           <w:szCs w:val="28"/>
-          <w:lang w:val="da-DK"/>
         </w:rPr>
         <w:t>V</w:t>
       </w:r>
@@ -214,7 +211,6 @@
           <w:color w:val="FF0000"/>
           <w:sz w:val="28"/>
           <w:szCs w:val="28"/>
-          <w:lang w:val="da-DK"/>
         </w:rPr>
         <w:t>ejarbejder</w:t>
       </w:r>
@@ -225,81 +221,37 @@
           <w:color w:val="FF0000"/>
           <w:sz w:val="28"/>
           <w:szCs w:val="28"/>
-          <w:lang w:val="da-DK"/>
         </w:rPr>
         <w:t xml:space="preserve"> og arrangementer</w:t>
+      </w:r>
+    </w:p>
+    <w:p/>
+    <w:p>
+      <w:r>
+        <w:t xml:space="preserve">Se interaktivt kort over trafik-info i kommunen: </w:t>
       </w:r>
     </w:p>
     <w:p>
-      <w:pPr>
-        <w:rPr>
-          <w:lang w:val="da-DK"/>
-        </w:rPr>
-      </w:pPr>
-    </w:p>
-    <w:p>
-      <w:pPr>
-        <w:rPr>
-          <w:lang w:val="da-DK"/>
-        </w:rPr>
-      </w:pPr>
-      <w:r>
-        <w:rPr>
-          <w:lang w:val="da-DK"/>
-        </w:rPr>
-        <w:t xml:space="preserve">Se interaktivt kort over trafik-info i kommunen: </w:t>
-      </w:r>
-    </w:p>
-    <w:p>
-      <w:pPr>
-        <w:rPr>
-          <w:lang w:val="da-DK"/>
-        </w:rPr>
-      </w:pPr>
       <w:hyperlink r:id="rId12" w:history="1">
         <w:r>
           <w:rPr>
             <w:rStyle w:val="Hyperlink"/>
-            <w:lang w:val="da-DK"/>
           </w:rPr>
           <w:t>https://www.vejle.dk/borger/mit-liv/trafik-og-parkering/trafikinformation/</w:t>
         </w:r>
       </w:hyperlink>
       <w:r>
-        <w:rPr>
-          <w:lang w:val="da-DK"/>
-        </w:rPr>
         <w:t xml:space="preserve"> </w:t>
       </w:r>
     </w:p>
+    <w:p/>
     <w:p>
-      <w:pPr>
-        <w:rPr>
-          <w:lang w:val="da-DK"/>
-        </w:rPr>
-      </w:pPr>
-    </w:p>
-    <w:p>
-      <w:pPr>
-        <w:rPr>
-          <w:lang w:val="da-DK"/>
-        </w:rPr>
-      </w:pPr>
       <w:r>
         <w:rPr>
           <w:i/>
           <w:iCs/>
-          <w:lang w:val="da-DK"/>
-        </w:rPr>
-        <w:t>Mere info om vejarbejde, trafikprojekter og busændringer. Se nederst</w:t>
-      </w:r>
-      <w:r>
-        <w:rPr>
-          <w:i/>
-          <w:iCs/>
-          <w:lang w:val="da-DK"/>
-        </w:rPr>
-        <w:t xml:space="preserve"> eller </w:t>
+        </w:rPr>
+        <w:t xml:space="preserve">Mere info om vejarbejde, trafikprojekter og busændringer. Se nederst eller </w:t>
       </w:r>
       <w:hyperlink w:anchor="_Mere_info_om" w:history="1">
         <w:r>
@@ -307,46 +259,20 @@
             <w:rStyle w:val="Hyperlink"/>
             <w:i/>
             <w:iCs/>
-            <w:lang w:val="da-DK"/>
           </w:rPr>
-          <w:t>klik</w:t>
-        </w:r>
-        <w:r>
-          <w:rPr>
-            <w:rStyle w:val="Hyperlink"/>
-            <w:i/>
-            <w:iCs/>
-            <w:lang w:val="da-DK"/>
-          </w:rPr>
-          <w:t xml:space="preserve"> </w:t>
-        </w:r>
-        <w:r>
-          <w:rPr>
-            <w:rStyle w:val="Hyperlink"/>
-            <w:i/>
-            <w:iCs/>
-            <w:lang w:val="da-DK"/>
-          </w:rPr>
-          <w:t>her</w:t>
+          <w:t>klik her</w:t>
         </w:r>
       </w:hyperlink>
       <w:r>
         <w:rPr>
           <w:i/>
           <w:iCs/>
-          <w:lang w:val="da-DK"/>
         </w:rPr>
         <w:t>.</w:t>
       </w:r>
     </w:p>
+    <w:p/>
     <w:p>
-      <w:pPr>
-        <w:rPr>
-          <w:lang w:val="da-DK"/>
-        </w:rPr>
-      </w:pPr>
-    </w:p>
-    <w:p>
       <w:r>
         <w:t>{</w:t>
       </w:r>
@@ -354,15 +280,24 @@
         <w:t xml:space="preserve">% </w:t>
       </w:r>
       <w:r>
-        <w:t>for object in</w:t>
+        <w:t xml:space="preserve">for </w:t>
+      </w:r>
+      <w:proofErr w:type="spellStart"/>
+      <w:r>
+        <w:t>object</w:t>
+      </w:r>
+      <w:proofErr w:type="spellEnd"/>
+      <w:r>
+        <w:t xml:space="preserve"> in</w:t>
       </w:r>
       <w:r>
         <w:t xml:space="preserve"> </w:t>
       </w:r>
-      <w:proofErr w:type="gramStart"/>
+      <w:proofErr w:type="spellStart"/>
       <w:r>
         <w:t>roadwork</w:t>
       </w:r>
+      <w:proofErr w:type="spellEnd"/>
       <w:r>
         <w:t xml:space="preserve"> </w:t>
       </w:r>
@@ -372,7 +307,6 @@
       <w:r>
         <w:t>}</w:t>
       </w:r>
-      <w:proofErr w:type="gramEnd"/>
     </w:p>
     <w:p>
       <w:pPr>
@@ -459,7 +393,6 @@
           <w:szCs w:val="24"/>
         </w:rPr>
       </w:pPr>
-      <w:proofErr w:type="spellStart"/>
       <w:r>
         <w:rPr>
           <w:b/>
@@ -467,9 +400,124 @@
           <w:sz w:val="24"/>
           <w:szCs w:val="24"/>
         </w:rPr>
-        <w:t>Hvornår</w:t>
+        <w:t>Hvornår:</w:t>
+      </w:r>
+      <w:r>
+        <w:t xml:space="preserve"> </w:t>
+      </w:r>
+      <w:proofErr w:type="gramStart"/>
+      <w:r>
+        <w:rPr>
+          <w:sz w:val="24"/>
+          <w:szCs w:val="24"/>
+        </w:rPr>
+        <w:t xml:space="preserve">{{ </w:t>
+      </w:r>
+      <w:proofErr w:type="spellStart"/>
+      <w:r>
+        <w:rPr>
+          <w:sz w:val="24"/>
+          <w:szCs w:val="24"/>
+        </w:rPr>
+        <w:t>object</w:t>
+      </w:r>
+      <w:proofErr w:type="gramEnd"/>
+      <w:r>
+        <w:rPr>
+          <w:sz w:val="24"/>
+          <w:szCs w:val="24"/>
+        </w:rPr>
+        <w:t>.</w:t>
+      </w:r>
+      <w:proofErr w:type="gramStart"/>
+      <w:r>
+        <w:rPr>
+          <w:sz w:val="24"/>
+          <w:szCs w:val="24"/>
+        </w:rPr>
+        <w:t>duration</w:t>
       </w:r>
       <w:proofErr w:type="spellEnd"/>
+      <w:r>
+        <w:rPr>
+          <w:sz w:val="24"/>
+          <w:szCs w:val="24"/>
+        </w:rPr>
+        <w:t xml:space="preserve"> }</w:t>
+      </w:r>
+      <w:proofErr w:type="gramEnd"/>
+      <w:r>
+        <w:rPr>
+          <w:sz w:val="24"/>
+          <w:szCs w:val="24"/>
+        </w:rPr>
+        <w:t>}</w:t>
+      </w:r>
+    </w:p>
+    <w:p>
+      <w:pPr>
+        <w:ind w:left="284"/>
+        <w:rPr>
+          <w:sz w:val="24"/>
+          <w:szCs w:val="24"/>
+        </w:rPr>
+      </w:pPr>
+      <w:r>
+        <w:rPr>
+          <w:sz w:val="24"/>
+          <w:szCs w:val="24"/>
+        </w:rPr>
+        <w:t xml:space="preserve">{% </w:t>
+      </w:r>
+      <w:proofErr w:type="spellStart"/>
+      <w:r>
+        <w:rPr>
+          <w:sz w:val="24"/>
+          <w:szCs w:val="24"/>
+        </w:rPr>
+        <w:t>if</w:t>
+      </w:r>
+      <w:proofErr w:type="spellEnd"/>
+      <w:r>
+        <w:rPr>
+          <w:sz w:val="24"/>
+          <w:szCs w:val="24"/>
+        </w:rPr>
+        <w:t xml:space="preserve"> </w:t>
+      </w:r>
+      <w:proofErr w:type="spellStart"/>
+      <w:proofErr w:type="gramStart"/>
+      <w:r>
+        <w:rPr>
+          <w:sz w:val="24"/>
+          <w:szCs w:val="24"/>
+        </w:rPr>
+        <w:t>object.road</w:t>
+      </w:r>
+      <w:proofErr w:type="gramEnd"/>
+      <w:r>
+        <w:rPr>
+          <w:sz w:val="24"/>
+          <w:szCs w:val="24"/>
+        </w:rPr>
+        <w:t>_info</w:t>
+      </w:r>
+      <w:proofErr w:type="spellEnd"/>
+      <w:r>
+        <w:rPr>
+          <w:sz w:val="24"/>
+          <w:szCs w:val="24"/>
+        </w:rPr>
+        <w:t xml:space="preserve"> </w:t>
+      </w:r>
+      <w:proofErr w:type="gramStart"/>
+      <w:r>
+        <w:rPr>
+          <w:sz w:val="24"/>
+          <w:szCs w:val="24"/>
+        </w:rPr>
+        <w:t>%}</w:t>
+      </w:r>
       <w:r>
         <w:rPr>
           <w:b/>
@@ -477,58 +525,72 @@
           <w:sz w:val="24"/>
           <w:szCs w:val="24"/>
         </w:rPr>
-        <w:t>:</w:t>
-      </w:r>
-      <w:r>
+        <w:t>Hvad</w:t>
+      </w:r>
+      <w:proofErr w:type="gramEnd"/>
+      <w:r>
+        <w:rPr>
+          <w:b/>
+          <w:bCs/>
+          <w:sz w:val="24"/>
+          <w:szCs w:val="24"/>
+        </w:rPr>
+        <w:t xml:space="preserve">: </w:t>
+      </w:r>
+      <w:proofErr w:type="gramStart"/>
+      <w:r>
+        <w:rPr>
+          <w:sz w:val="24"/>
+          <w:szCs w:val="24"/>
+        </w:rPr>
+        <w:t xml:space="preserve">{{ </w:t>
+      </w:r>
+      <w:proofErr w:type="spellStart"/>
+      <w:r>
+        <w:rPr>
+          <w:sz w:val="24"/>
+          <w:szCs w:val="24"/>
+        </w:rPr>
+        <w:t>object</w:t>
+      </w:r>
+      <w:proofErr w:type="gramEnd"/>
+      <w:r>
+        <w:rPr>
+          <w:sz w:val="24"/>
+          <w:szCs w:val="24"/>
+        </w:rPr>
+        <w:t>.road_</w:t>
+      </w:r>
+      <w:proofErr w:type="gramStart"/>
+      <w:r>
+        <w:rPr>
+          <w:sz w:val="24"/>
+          <w:szCs w:val="24"/>
+        </w:rPr>
+        <w:t>info</w:t>
+      </w:r>
+      <w:proofErr w:type="spellEnd"/>
+      <w:r>
+        <w:rPr>
+          <w:sz w:val="24"/>
+          <w:szCs w:val="24"/>
+        </w:rPr>
+        <w:t xml:space="preserve"> }</w:t>
+      </w:r>
+      <w:proofErr w:type="gramEnd"/>
+      <w:r>
+        <w:rPr>
+          <w:sz w:val="24"/>
+          <w:szCs w:val="24"/>
+        </w:rPr>
+        <w:t>}</w:t>
+      </w:r>
+      <w:r>
+        <w:rPr>
+          <w:sz w:val="24"/>
+          <w:szCs w:val="24"/>
+        </w:rPr>
         <w:t xml:space="preserve"> </w:t>
-      </w:r>
-      <w:proofErr w:type="gramStart"/>
-      <w:r>
-        <w:rPr>
-          <w:sz w:val="24"/>
-          <w:szCs w:val="24"/>
-        </w:rPr>
-        <w:t xml:space="preserve">{{ </w:t>
-      </w:r>
-      <w:proofErr w:type="spellStart"/>
-      <w:r>
-        <w:rPr>
-          <w:sz w:val="24"/>
-          <w:szCs w:val="24"/>
-        </w:rPr>
-        <w:t>object</w:t>
-      </w:r>
-      <w:proofErr w:type="gramEnd"/>
-      <w:r>
-        <w:rPr>
-          <w:sz w:val="24"/>
-          <w:szCs w:val="24"/>
-        </w:rPr>
-        <w:t>.</w:t>
-      </w:r>
-      <w:proofErr w:type="gramStart"/>
-      <w:r>
-        <w:rPr>
-          <w:sz w:val="24"/>
-          <w:szCs w:val="24"/>
-        </w:rPr>
-        <w:t>duration</w:t>
-      </w:r>
-      <w:proofErr w:type="spellEnd"/>
-      <w:r>
-        <w:rPr>
-          <w:sz w:val="24"/>
-          <w:szCs w:val="24"/>
-        </w:rPr>
-        <w:t xml:space="preserve"> }</w:t>
-      </w:r>
-      <w:proofErr w:type="gramEnd"/>
-      <w:r>
-        <w:rPr>
-          <w:sz w:val="24"/>
-          <w:szCs w:val="24"/>
-        </w:rPr>
-        <w:t>}</w:t>
       </w:r>
     </w:p>
     <w:p>
@@ -544,42 +606,32 @@
           <w:sz w:val="24"/>
           <w:szCs w:val="24"/>
         </w:rPr>
-        <w:t xml:space="preserve">{% if </w:t>
+        <w:t xml:space="preserve">{% </w:t>
       </w:r>
       <w:proofErr w:type="spellStart"/>
+      <w:r>
+        <w:rPr>
+          <w:sz w:val="24"/>
+          <w:szCs w:val="24"/>
+        </w:rPr>
+        <w:t>endif</w:t>
+      </w:r>
+      <w:proofErr w:type="spellEnd"/>
+      <w:r>
+        <w:rPr>
+          <w:sz w:val="24"/>
+          <w:szCs w:val="24"/>
+        </w:rPr>
+        <w:t xml:space="preserve"> </w:t>
+      </w:r>
       <w:proofErr w:type="gramStart"/>
       <w:r>
         <w:rPr>
           <w:sz w:val="24"/>
           <w:szCs w:val="24"/>
         </w:rPr>
-        <w:t>object.road</w:t>
-      </w:r>
-      <w:proofErr w:type="gramEnd"/>
-      <w:r>
-        <w:rPr>
-          <w:sz w:val="24"/>
-          <w:szCs w:val="24"/>
-        </w:rPr>
-        <w:t>_info</w:t>
-      </w:r>
-      <w:proofErr w:type="spellEnd"/>
-      <w:r>
-        <w:rPr>
-          <w:sz w:val="24"/>
-          <w:szCs w:val="24"/>
-        </w:rPr>
-        <w:t xml:space="preserve"> </w:t>
-      </w:r>
-      <w:proofErr w:type="gramStart"/>
-      <w:r>
-        <w:rPr>
-          <w:sz w:val="24"/>
-          <w:szCs w:val="24"/>
-        </w:rPr>
         <w:t>%}</w:t>
       </w:r>
-      <w:proofErr w:type="spellStart"/>
       <w:r>
         <w:rPr>
           <w:b/>
@@ -587,9 +639,8 @@
           <w:sz w:val="24"/>
           <w:szCs w:val="24"/>
         </w:rPr>
-        <w:t>Hvad</w:t>
-      </w:r>
-      <w:proofErr w:type="spellEnd"/>
+        <w:t>Sagsnummer</w:t>
+      </w:r>
       <w:proofErr w:type="gramEnd"/>
       <w:r>
         <w:rPr>
@@ -622,7 +673,7 @@
           <w:sz w:val="24"/>
           <w:szCs w:val="24"/>
         </w:rPr>
-        <w:t>.road_</w:t>
+        <w:t>.case_</w:t>
       </w:r>
       <w:proofErr w:type="gramStart"/>
       <w:r>
@@ -630,7 +681,7 @@
           <w:sz w:val="24"/>
           <w:szCs w:val="24"/>
         </w:rPr>
-        <w:t>info</w:t>
+        <w:t>id</w:t>
       </w:r>
       <w:proofErr w:type="spellEnd"/>
       <w:r>
@@ -647,91 +698,18 @@
           <w:szCs w:val="24"/>
         </w:rPr>
         <w:t>}</w:t>
-      </w:r>
-      <w:r>
-        <w:rPr>
-          <w:sz w:val="24"/>
-          <w:szCs w:val="24"/>
-        </w:rPr>
-        <w:t xml:space="preserve"> </w:t>
       </w:r>
     </w:p>
     <w:p>
       <w:pPr>
         <w:ind w:left="284"/>
         <w:rPr>
-          <w:sz w:val="24"/>
-          <w:szCs w:val="24"/>
-        </w:rPr>
-      </w:pPr>
-      <w:r>
-        <w:rPr>
-          <w:sz w:val="24"/>
-          <w:szCs w:val="24"/>
-        </w:rPr>
-        <w:t xml:space="preserve">{% endif </w:t>
-      </w:r>
-      <w:proofErr w:type="gramStart"/>
-      <w:r>
-        <w:rPr>
-          <w:sz w:val="24"/>
-          <w:szCs w:val="24"/>
-        </w:rPr>
-        <w:t>%}</w:t>
-      </w:r>
-      <w:r>
-        <w:rPr>
-          <w:sz w:val="24"/>
-          <w:szCs w:val="24"/>
-        </w:rPr>
-        <w:t>{</w:t>
-      </w:r>
-      <w:proofErr w:type="gramEnd"/>
-      <w:r>
-        <w:rPr>
-          <w:sz w:val="24"/>
-          <w:szCs w:val="24"/>
-        </w:rPr>
-        <w:t xml:space="preserve">% if </w:t>
-      </w:r>
-      <w:proofErr w:type="spellStart"/>
-      <w:proofErr w:type="gramStart"/>
-      <w:r>
-        <w:rPr>
-          <w:sz w:val="24"/>
-          <w:szCs w:val="24"/>
-        </w:rPr>
-        <w:t>object.reroute</w:t>
-      </w:r>
-      <w:proofErr w:type="spellEnd"/>
-      <w:proofErr w:type="gramEnd"/>
-      <w:r>
-        <w:rPr>
-          <w:sz w:val="24"/>
-          <w:szCs w:val="24"/>
-        </w:rPr>
-        <w:t xml:space="preserve"> </w:t>
-      </w:r>
-      <w:proofErr w:type="gramStart"/>
-      <w:r>
-        <w:rPr>
-          <w:sz w:val="24"/>
-          <w:szCs w:val="24"/>
-        </w:rPr>
-        <w:t>%}</w:t>
-      </w:r>
-      <w:proofErr w:type="spellStart"/>
-      <w:r>
-        <w:rPr>
           <w:b/>
           <w:bCs/>
           <w:sz w:val="24"/>
           <w:szCs w:val="24"/>
         </w:rPr>
-        <w:t>Omkørsel</w:t>
-      </w:r>
-      <w:proofErr w:type="spellEnd"/>
-      <w:proofErr w:type="gramEnd"/>
+      </w:pPr>
       <w:r>
         <w:rPr>
           <w:b/>
@@ -739,14 +717,7 @@
           <w:sz w:val="24"/>
           <w:szCs w:val="24"/>
         </w:rPr>
-        <w:t xml:space="preserve"> via:</w:t>
-      </w:r>
-      <w:r>
-        <w:rPr>
-          <w:sz w:val="24"/>
-          <w:szCs w:val="24"/>
-        </w:rPr>
-        <w:t xml:space="preserve"> </w:t>
+        <w:t xml:space="preserve">Entreprenør: </w:t>
       </w:r>
       <w:proofErr w:type="gramStart"/>
       <w:r>
@@ -754,8 +725,57 @@
           <w:sz w:val="24"/>
           <w:szCs w:val="24"/>
         </w:rPr>
-        <w:t>{{</w:t>
-      </w:r>
+        <w:t xml:space="preserve">{{ </w:t>
+      </w:r>
+      <w:proofErr w:type="spellStart"/>
+      <w:r>
+        <w:rPr>
+          <w:sz w:val="24"/>
+          <w:szCs w:val="24"/>
+        </w:rPr>
+        <w:t>object</w:t>
+      </w:r>
+      <w:proofErr w:type="gramEnd"/>
+      <w:r>
+        <w:rPr>
+          <w:sz w:val="24"/>
+          <w:szCs w:val="24"/>
+        </w:rPr>
+        <w:t>.contractor_</w:t>
+      </w:r>
+      <w:proofErr w:type="gramStart"/>
+      <w:r>
+        <w:rPr>
+          <w:sz w:val="24"/>
+          <w:szCs w:val="24"/>
+        </w:rPr>
+        <w:t>company</w:t>
+      </w:r>
+      <w:proofErr w:type="spellEnd"/>
+      <w:r>
+        <w:rPr>
+          <w:sz w:val="24"/>
+          <w:szCs w:val="24"/>
+        </w:rPr>
+        <w:t xml:space="preserve"> }</w:t>
+      </w:r>
+      <w:proofErr w:type="gramEnd"/>
+      <w:r>
+        <w:rPr>
+          <w:sz w:val="24"/>
+          <w:szCs w:val="24"/>
+        </w:rPr>
+        <w:t>}</w:t>
+      </w:r>
+    </w:p>
+    <w:p>
+      <w:pPr>
+        <w:ind w:left="284"/>
+        <w:rPr>
+          <w:sz w:val="24"/>
+          <w:szCs w:val="24"/>
+        </w:rPr>
+      </w:pPr>
       <w:r>
         <w:rPr>
           <w:b/>
@@ -763,7 +783,15 @@
           <w:sz w:val="24"/>
           <w:szCs w:val="24"/>
         </w:rPr>
-        <w:t xml:space="preserve"> </w:t>
+        <w:t xml:space="preserve">Kontaktperson: </w:t>
+      </w:r>
+      <w:proofErr w:type="gramStart"/>
+      <w:r>
+        <w:rPr>
+          <w:sz w:val="24"/>
+          <w:szCs w:val="24"/>
+        </w:rPr>
+        <w:t xml:space="preserve">{{ </w:t>
       </w:r>
       <w:proofErr w:type="spellStart"/>
       <w:r>
@@ -779,7 +807,7 @@
           <w:sz w:val="24"/>
           <w:szCs w:val="24"/>
         </w:rPr>
-        <w:t>.</w:t>
+        <w:t>.contractor_contact_</w:t>
       </w:r>
       <w:proofErr w:type="gramStart"/>
       <w:r>
@@ -787,7 +815,7 @@
           <w:sz w:val="24"/>
           <w:szCs w:val="24"/>
         </w:rPr>
-        <w:t>reroute</w:t>
+        <w:t>person</w:t>
       </w:r>
       <w:proofErr w:type="spellEnd"/>
       <w:r>
@@ -804,215 +832,25 @@
           <w:szCs w:val="24"/>
         </w:rPr>
         <w:t>}</w:t>
-      </w:r>
-      <w:r>
-        <w:rPr>
-          <w:sz w:val="24"/>
-          <w:szCs w:val="24"/>
-        </w:rPr>
-        <w:t xml:space="preserve"> </w:t>
       </w:r>
     </w:p>
     <w:p>
       <w:pPr>
         <w:ind w:left="284"/>
         <w:rPr>
+          <w:sz w:val="24"/>
+          <w:szCs w:val="24"/>
+        </w:rPr>
+      </w:pPr>
+      <w:r>
+        <w:rPr>
           <w:b/>
           <w:bCs/>
           <w:sz w:val="24"/>
           <w:szCs w:val="24"/>
         </w:rPr>
-      </w:pPr>
-      <w:r>
-        <w:rPr>
-          <w:sz w:val="24"/>
-          <w:szCs w:val="24"/>
-        </w:rPr>
-        <w:t xml:space="preserve">{% endif </w:t>
-      </w:r>
-      <w:proofErr w:type="gramStart"/>
-      <w:r>
-        <w:rPr>
-          <w:sz w:val="24"/>
-          <w:szCs w:val="24"/>
-        </w:rPr>
-        <w:t>%}</w:t>
-      </w:r>
-      <w:proofErr w:type="spellStart"/>
-      <w:r>
-        <w:rPr>
-          <w:b/>
-          <w:bCs/>
-          <w:sz w:val="24"/>
-          <w:szCs w:val="24"/>
-        </w:rPr>
-        <w:t>Entreprenør</w:t>
-      </w:r>
-      <w:proofErr w:type="spellEnd"/>
-      <w:proofErr w:type="gramEnd"/>
-      <w:r>
-        <w:rPr>
-          <w:b/>
-          <w:bCs/>
-          <w:sz w:val="24"/>
-          <w:szCs w:val="24"/>
-        </w:rPr>
-        <w:t>:</w:t>
-      </w:r>
-      <w:r>
-        <w:rPr>
-          <w:b/>
-          <w:bCs/>
-          <w:sz w:val="24"/>
-          <w:szCs w:val="24"/>
-        </w:rPr>
-        <w:t xml:space="preserve"> </w:t>
-      </w:r>
-      <w:proofErr w:type="gramStart"/>
-      <w:r>
-        <w:rPr>
-          <w:sz w:val="24"/>
-          <w:szCs w:val="24"/>
-        </w:rPr>
-        <w:t xml:space="preserve">{{ </w:t>
-      </w:r>
-      <w:proofErr w:type="spellStart"/>
-      <w:r>
-        <w:rPr>
-          <w:sz w:val="24"/>
-          <w:szCs w:val="24"/>
-        </w:rPr>
-        <w:t>object</w:t>
-      </w:r>
-      <w:proofErr w:type="gramEnd"/>
-      <w:r>
-        <w:rPr>
-          <w:sz w:val="24"/>
-          <w:szCs w:val="24"/>
-        </w:rPr>
-        <w:t>.contractor_</w:t>
-      </w:r>
-      <w:proofErr w:type="gramStart"/>
-      <w:r>
-        <w:rPr>
-          <w:sz w:val="24"/>
-          <w:szCs w:val="24"/>
-        </w:rPr>
-        <w:t>company</w:t>
-      </w:r>
-      <w:proofErr w:type="spellEnd"/>
-      <w:r>
-        <w:rPr>
-          <w:sz w:val="24"/>
-          <w:szCs w:val="24"/>
-        </w:rPr>
-        <w:t xml:space="preserve"> }</w:t>
-      </w:r>
-      <w:proofErr w:type="gramEnd"/>
-      <w:r>
-        <w:rPr>
-          <w:sz w:val="24"/>
-          <w:szCs w:val="24"/>
-        </w:rPr>
-        <w:t>}</w:t>
-      </w:r>
-    </w:p>
-    <w:p>
-      <w:pPr>
-        <w:ind w:left="284"/>
-        <w:rPr>
-          <w:sz w:val="24"/>
-          <w:szCs w:val="24"/>
-        </w:rPr>
-      </w:pPr>
-      <w:proofErr w:type="spellStart"/>
-      <w:r>
-        <w:rPr>
-          <w:b/>
-          <w:bCs/>
-          <w:sz w:val="24"/>
-          <w:szCs w:val="24"/>
-        </w:rPr>
-        <w:t>Kontaktperson</w:t>
-      </w:r>
-      <w:proofErr w:type="spellEnd"/>
-      <w:r>
-        <w:rPr>
-          <w:b/>
-          <w:bCs/>
-          <w:sz w:val="24"/>
-          <w:szCs w:val="24"/>
-        </w:rPr>
-        <w:t xml:space="preserve">: </w:t>
-      </w:r>
-      <w:proofErr w:type="gramStart"/>
-      <w:r>
-        <w:rPr>
-          <w:sz w:val="24"/>
-          <w:szCs w:val="24"/>
-        </w:rPr>
-        <w:t xml:space="preserve">{{ </w:t>
-      </w:r>
-      <w:proofErr w:type="spellStart"/>
-      <w:r>
-        <w:rPr>
-          <w:sz w:val="24"/>
-          <w:szCs w:val="24"/>
-        </w:rPr>
-        <w:t>object</w:t>
-      </w:r>
-      <w:proofErr w:type="gramEnd"/>
-      <w:r>
-        <w:rPr>
-          <w:sz w:val="24"/>
-          <w:szCs w:val="24"/>
-        </w:rPr>
-        <w:t>.contractor_contact_</w:t>
-      </w:r>
-      <w:proofErr w:type="gramStart"/>
-      <w:r>
-        <w:rPr>
-          <w:sz w:val="24"/>
-          <w:szCs w:val="24"/>
-        </w:rPr>
-        <w:t>person</w:t>
-      </w:r>
-      <w:proofErr w:type="spellEnd"/>
-      <w:r>
-        <w:rPr>
-          <w:sz w:val="24"/>
-          <w:szCs w:val="24"/>
-        </w:rPr>
-        <w:t xml:space="preserve"> }</w:t>
-      </w:r>
-      <w:proofErr w:type="gramEnd"/>
-      <w:r>
-        <w:rPr>
-          <w:sz w:val="24"/>
-          <w:szCs w:val="24"/>
-        </w:rPr>
-        <w:t>}</w:t>
-      </w:r>
-    </w:p>
-    <w:p>
-      <w:pPr>
-        <w:ind w:left="284"/>
-        <w:rPr>
-          <w:sz w:val="24"/>
-          <w:szCs w:val="24"/>
-        </w:rPr>
-      </w:pPr>
-      <w:proofErr w:type="spellStart"/>
-      <w:r>
-        <w:rPr>
-          <w:b/>
-          <w:bCs/>
-          <w:sz w:val="24"/>
-          <w:szCs w:val="24"/>
-        </w:rPr>
         <w:t>Telefon</w:t>
       </w:r>
-      <w:proofErr w:type="spellEnd"/>
       <w:r>
         <w:rPr>
           <w:b/>
@@ -1119,7 +957,6 @@
           <w:rFonts w:ascii="Arial" w:hAnsi="Arial" w:cs="Arial"/>
           <w:sz w:val="22"/>
           <w:szCs w:val="22"/>
-          <w:lang w:val="da-DK"/>
         </w:rPr>
       </w:pPr>
       <w:bookmarkStart w:id="1" w:name="_Mere_info_om"/>
@@ -1130,7 +967,6 @@
           <w:b/>
           <w:sz w:val="22"/>
           <w:szCs w:val="22"/>
-          <w:lang w:val="da-DK"/>
         </w:rPr>
         <w:lastRenderedPageBreak/>
         <w:t>Mere info om vejarbejde, trafikprojekter og busændringer:</w:t>
@@ -1144,7 +980,6 @@
           <w:rFonts w:ascii="Arial" w:hAnsi="Arial" w:cs="Arial"/>
           <w:sz w:val="22"/>
           <w:szCs w:val="22"/>
-          <w:lang w:val="da-DK"/>
         </w:rPr>
       </w:pPr>
     </w:p>
@@ -1161,14 +996,10 @@
         </w:tabs>
         <w:spacing w:before="0"/>
         <w:ind w:left="0" w:hanging="360"/>
-        <w:rPr>
-          <w:lang w:val="da-DK"/>
-        </w:rPr>
-      </w:pPr>
-      <w:r>
-        <w:rPr>
-          <w:noProof/>
-          <w:lang w:val="da-DK" w:eastAsia="da-DK"/>
+      </w:pPr>
+      <w:r>
+        <w:rPr>
+          <w:lang w:eastAsia="da-DK"/>
         </w:rPr>
         <mc:AlternateContent>
           <mc:Choice Requires="wps">
@@ -1246,21 +1077,12 @@
         </mc:AlternateContent>
       </w:r>
       <w:r>
-        <w:rPr>
-          <w:lang w:val="da-DK"/>
-        </w:rPr>
         <w:t>Større projekter i trafikken</w:t>
       </w:r>
       <w:r>
-        <w:rPr>
-          <w:lang w:val="da-DK"/>
-        </w:rPr>
         <w:t>:</w:t>
       </w:r>
       <w:r>
-        <w:rPr>
-          <w:lang w:val="da-DK"/>
-        </w:rPr>
         <w:t xml:space="preserve"> </w:t>
       </w:r>
     </w:p>
@@ -1271,7 +1093,6 @@
         <w:rPr>
           <w:sz w:val="22"/>
           <w:szCs w:val="22"/>
-          <w:lang w:val="da-DK"/>
         </w:rPr>
       </w:pPr>
       <w:hyperlink r:id="rId13" w:history="1">
@@ -1280,7 +1101,6 @@
             <w:rStyle w:val="Hyperlink"/>
             <w:sz w:val="22"/>
             <w:szCs w:val="22"/>
-            <w:lang w:val="da-DK"/>
           </w:rPr>
           <w:t>https://www.vejle.dk/borger/mit-liv/trafik-og-parkering/stoerre-projekter-i-trafikken/</w:t>
         </w:r>
@@ -1293,7 +1113,6 @@
         <w:rPr>
           <w:sz w:val="22"/>
           <w:szCs w:val="22"/>
-          <w:lang w:val="da-DK"/>
         </w:rPr>
       </w:pPr>
     </w:p>
@@ -1310,29 +1129,19 @@
         </w:tabs>
         <w:spacing w:before="0"/>
         <w:ind w:left="0" w:hanging="360"/>
-        <w:rPr>
-          <w:lang w:val="da-DK"/>
-        </w:rPr>
       </w:pPr>
       <w:proofErr w:type="spellStart"/>
       <w:r>
-        <w:rPr>
-          <w:lang w:val="da-DK"/>
-        </w:rPr>
         <w:t>Oversigtkort</w:t>
       </w:r>
       <w:proofErr w:type="spellEnd"/>
       <w:r>
-        <w:rPr>
-          <w:lang w:val="da-DK"/>
-        </w:rPr>
         <w:t xml:space="preserve"> - gravearbejde:</w:t>
       </w:r>
       <w:r>
         <w:rPr>
           <w:color w:val="0000FF"/>
           <w:spacing w:val="2"/>
-          <w:lang w:val="da-DK"/>
         </w:rPr>
         <w:t xml:space="preserve"> </w:t>
       </w:r>
@@ -1341,7 +1150,6 @@
           <w:rPr>
             <w:rStyle w:val="Hyperlink"/>
             <w:color w:val="0000FF"/>
-            <w:lang w:val="da-DK"/>
           </w:rPr>
           <w:t>http://oov2.vd.dk/oov2-ui/</w:t>
         </w:r>
@@ -1350,7 +1158,6 @@
         <w:rPr>
           <w:rStyle w:val="Hyperlink"/>
           <w:color w:val="0000FF"/>
-          <w:lang w:val="da-DK"/>
         </w:rPr>
         <w:t xml:space="preserve"> </w:t>
       </w:r>
@@ -1362,7 +1169,6 @@
         <w:rPr>
           <w:sz w:val="22"/>
           <w:szCs w:val="22"/>
-          <w:lang w:val="da-DK"/>
         </w:rPr>
       </w:pPr>
     </w:p>
@@ -1379,21 +1185,14 @@
         </w:tabs>
         <w:spacing w:before="0"/>
         <w:ind w:left="0"/>
-        <w:rPr>
-          <w:lang w:val="da-DK"/>
-        </w:rPr>
-      </w:pPr>
-      <w:r>
-        <w:rPr>
-          <w:lang w:val="da-DK"/>
-        </w:rPr>
+      </w:pPr>
+      <w:r>
         <w:t>Vejdirektoratets trafikkort:</w:t>
       </w:r>
       <w:r>
         <w:rPr>
           <w:color w:val="0000FF"/>
           <w:spacing w:val="4"/>
-          <w:lang w:val="da-DK"/>
         </w:rPr>
         <w:t xml:space="preserve"> </w:t>
       </w:r>
@@ -1402,7 +1201,6 @@
           <w:rPr>
             <w:rStyle w:val="Hyperlink"/>
             <w:u w:color="0000FF"/>
-            <w:lang w:val="da-DK"/>
           </w:rPr>
           <w:t>https://trafikkort.vejdirektoratet.dk/</w:t>
         </w:r>
@@ -1415,7 +1213,6 @@
         <w:rPr>
           <w:sz w:val="22"/>
           <w:szCs w:val="22"/>
-          <w:lang w:val="da-DK"/>
         </w:rPr>
       </w:pPr>
     </w:p>
@@ -1432,20 +1229,13 @@
         </w:tabs>
         <w:spacing w:before="0"/>
         <w:ind w:left="0" w:hanging="360"/>
-        <w:rPr>
-          <w:lang w:val="da-DK"/>
-        </w:rPr>
-      </w:pPr>
-      <w:r>
-        <w:rPr>
-          <w:lang w:val="da-DK"/>
-        </w:rPr>
+      </w:pPr>
+      <w:r>
         <w:t>Ændringer i buskørslen vil fremgå her:</w:t>
       </w:r>
       <w:r>
         <w:rPr>
           <w:color w:val="0000FF"/>
-          <w:lang w:val="da-DK"/>
         </w:rPr>
         <w:t xml:space="preserve"> </w:t>
       </w:r>
@@ -1453,7 +1243,6 @@
         <w:rPr>
           <w:color w:val="0000FF"/>
           <w:u w:val="single" w:color="0000FF"/>
-          <w:lang w:val="da-DK"/>
         </w:rPr>
         <w:t>https://www.sydtrafik.dk/trafikinfo/vejle-</w:t>
       </w:r>
@@ -1462,7 +1251,6 @@
           <w:rPr>
             <w:color w:val="0000FF"/>
             <w:u w:val="single" w:color="0000FF"/>
-            <w:lang w:val="da-DK"/>
           </w:rPr>
           <w:t>kommune</w:t>
         </w:r>
@@ -1471,9 +1259,6 @@
     <w:p>
       <w:pPr>
         <w:pStyle w:val="Listeafsnit"/>
-        <w:rPr>
-          <w:lang w:val="da-DK"/>
-        </w:rPr>
       </w:pPr>
     </w:p>
     <w:p>
@@ -1489,21 +1274,14 @@
         </w:tabs>
         <w:spacing w:before="0"/>
         <w:ind w:left="0" w:hanging="360"/>
-        <w:rPr>
-          <w:lang w:val="da-DK"/>
-        </w:rPr>
-      </w:pPr>
-      <w:r>
-        <w:rPr>
-          <w:lang w:val="da-DK"/>
-        </w:rPr>
+      </w:pPr>
+      <w:r>
         <w:t xml:space="preserve">Gis kort Vejle kommune: </w:t>
       </w:r>
       <w:hyperlink r:id="rId17" w:history="1">
         <w:r>
           <w:rPr>
             <w:rStyle w:val="Hyperlink"/>
-            <w:lang w:val="da-DK"/>
           </w:rPr>
           <w:t>www.kortvejle.dk</w:t>
         </w:r>
@@ -1512,9 +1290,6 @@
     <w:p>
       <w:pPr>
         <w:pStyle w:val="Listeafsnit"/>
-        <w:rPr>
-          <w:lang w:val="da-DK"/>
-        </w:rPr>
       </w:pPr>
     </w:p>
     <w:p>
@@ -1526,9 +1301,6 @@
         </w:tabs>
         <w:spacing w:before="0"/>
         <w:ind w:left="0" w:firstLine="0"/>
-        <w:rPr>
-          <w:lang w:val="da-DK"/>
-        </w:rPr>
       </w:pPr>
     </w:p>
     <w:bookmarkEnd w:id="0"/>
@@ -1538,9 +1310,6 @@
           <w:tab w:val="left" w:pos="833"/>
           <w:tab w:val="left" w:pos="834"/>
         </w:tabs>
-        <w:rPr>
-          <w:lang w:val="da-DK"/>
-        </w:rPr>
       </w:pPr>
     </w:p>
     <w:p>
@@ -1549,56 +1318,32 @@
           <w:tab w:val="left" w:pos="833"/>
           <w:tab w:val="left" w:pos="834"/>
         </w:tabs>
-        <w:rPr>
-          <w:lang w:val="da-DK"/>
-        </w:rPr>
-      </w:pPr>
-      <w:r>
-        <w:rPr>
-          <w:lang w:val="da-DK"/>
-        </w:rPr>
+      </w:pPr>
+      <w:r>
         <w:t xml:space="preserve">Lavet </w:t>
       </w:r>
       <w:proofErr w:type="gramStart"/>
       <w:r>
-        <w:rPr>
-          <w:lang w:val="da-DK"/>
-        </w:rPr>
         <w:t xml:space="preserve">{{ </w:t>
       </w:r>
       <w:proofErr w:type="spellStart"/>
       <w:r>
-        <w:rPr>
-          <w:lang w:val="da-DK"/>
-        </w:rPr>
         <w:t>today</w:t>
       </w:r>
       <w:proofErr w:type="gramEnd"/>
       <w:r>
-        <w:rPr>
-          <w:lang w:val="da-DK"/>
-        </w:rPr>
         <w:t>_</w:t>
       </w:r>
       <w:proofErr w:type="gramStart"/>
       <w:r>
-        <w:rPr>
-          <w:lang w:val="da-DK"/>
-        </w:rPr>
         <w:t>date</w:t>
       </w:r>
       <w:proofErr w:type="spellEnd"/>
       <w:r>
-        <w:rPr>
-          <w:lang w:val="da-DK"/>
-        </w:rPr>
         <w:t xml:space="preserve"> }</w:t>
       </w:r>
       <w:proofErr w:type="gramEnd"/>
       <w:r>
-        <w:rPr>
-          <w:lang w:val="da-DK"/>
-        </w:rPr>
         <w:t>}</w:t>
       </w:r>
     </w:p>
@@ -1668,9 +1413,6 @@
           <w:jc w:val="right"/>
         </w:pPr>
         <w:r>
-          <w:rPr>
-            <w:lang w:val="da-DK"/>
-          </w:rPr>
           <w:t xml:space="preserve">Side </w:t>
         </w:r>
         <w:r>
@@ -1702,7 +1444,6 @@
           <w:rPr>
             <w:b/>
             <w:bCs/>
-            <w:noProof/>
           </w:rPr>
           <w:t>2</w:t>
         </w:r>
@@ -1716,9 +1457,6 @@
           <w:fldChar w:fldCharType="end"/>
         </w:r>
         <w:r>
-          <w:rPr>
-            <w:lang w:val="da-DK"/>
-          </w:rPr>
           <w:t xml:space="preserve"> af </w:t>
         </w:r>
         <w:r>
@@ -1750,7 +1488,6 @@
           <w:rPr>
             <w:b/>
             <w:bCs/>
-            <w:noProof/>
           </w:rPr>
           <w:t>5</w:t>
         </w:r>
@@ -3399,7 +3136,6 @@
     </w:pPr>
     <w:rPr>
       <w:rFonts w:ascii="Arial" w:eastAsia="Arial" w:hAnsi="Arial" w:cs="Arial"/>
-      <w:lang w:val="en-US"/>
     </w:rPr>
   </w:style>
   <w:style w:type="paragraph" w:styleId="Overskrift1">
@@ -3463,6 +3199,7 @@
   <w:style w:type="character" w:default="1" w:styleId="Standardskrifttypeiafsnit">
     <w:name w:val="Default Paragraph Font"/>
     <w:uiPriority w:val="1"/>
+    <w:semiHidden/>
     <w:unhideWhenUsed/>
   </w:style>
   <w:style w:type="table" w:default="1" w:styleId="Tabel-Normal">
@@ -3577,7 +3314,6 @@
       <w:color w:val="000000"/>
       <w:sz w:val="24"/>
       <w:szCs w:val="24"/>
-      <w:lang w:val="da-DK"/>
     </w:rPr>
   </w:style>
   <w:style w:type="paragraph" w:styleId="Almindeligtekst">
@@ -3714,7 +3450,7 @@
       <w:rFonts w:ascii="Times New Roman" w:eastAsia="Times New Roman" w:hAnsi="Times New Roman" w:cs="Times New Roman"/>
       <w:sz w:val="24"/>
       <w:szCs w:val="24"/>
-      <w:lang w:val="da-DK" w:eastAsia="da-DK"/>
+      <w:lang w:eastAsia="da-DK"/>
     </w:rPr>
   </w:style>
   <w:style w:type="character" w:customStyle="1" w:styleId="Overskrift3Tegn">
@@ -3757,7 +3493,7 @@
       <w:rFonts w:ascii="Times New Roman" w:eastAsiaTheme="minorHAnsi" w:hAnsi="Times New Roman" w:cs="Times New Roman"/>
       <w:sz w:val="24"/>
       <w:szCs w:val="24"/>
-      <w:lang w:val="da-DK" w:eastAsia="da-DK"/>
+      <w:lang w:eastAsia="da-DK"/>
     </w:rPr>
   </w:style>
   <w:style w:type="character" w:styleId="Strk">
@@ -3788,7 +3524,7 @@
     </w:pPr>
     <w:rPr>
       <w:rFonts w:ascii="Calibri" w:eastAsiaTheme="minorHAnsi" w:hAnsi="Calibri" w:cs="Calibri"/>
-      <w:lang w:val="da-DK" w:eastAsia="da-DK"/>
+      <w:lang w:eastAsia="da-DK"/>
     </w:rPr>
   </w:style>
   <w:style w:type="character" w:styleId="Ulstomtale">
@@ -4098,19 +3834,6 @@
 </file>
 
 <file path=customXml/item1.xml><?xml version="1.0" encoding="utf-8"?>
-<b:Sources xmlns:b="http://schemas.openxmlformats.org/officeDocument/2006/bibliography" xmlns="http://schemas.openxmlformats.org/officeDocument/2006/bibliography" SelectedStyle="\APASixthEditionOfficeOnline.xsl" StyleName="APA" Version="6"/>
-</file>
-
-<file path=customXml/item2.xml><?xml version="1.0" encoding="utf-8"?>
-<?mso-contentType ?>
-<FormTemplates xmlns="http://schemas.microsoft.com/sharepoint/v3/contenttype/forms">
-  <Display>DocumentLibraryForm</Display>
-  <Edit>DocumentLibraryForm</Edit>
-  <New>DocumentLibraryForm</New>
-</FormTemplates>
-</file>
-
-<file path=customXml/item3.xml><?xml version="1.0" encoding="utf-8"?>
 <ct:contentTypeSchema xmlns:ct="http://schemas.microsoft.com/office/2006/metadata/contentType" xmlns:ma="http://schemas.microsoft.com/office/2006/metadata/properties/metaAttributes" ct:_="" ma:_="" ma:contentTypeName="Dokument" ma:contentTypeID="0x01010049C70D0A0096604F99C38C5E890DFF51" ma:contentTypeVersion="19" ma:contentTypeDescription="Opret et nyt dokument." ma:contentTypeScope="" ma:versionID="4497dac9be348ab89934b16451975fc4">
   <xsd:schema xmlns:xsd="http://www.w3.org/2001/XMLSchema" xmlns:xs="http://www.w3.org/2001/XMLSchema" xmlns:p="http://schemas.microsoft.com/office/2006/metadata/properties" xmlns:ns2="336891e5-a8e3-4741-8dd3-dc88c7bdbb7b" xmlns:ns3="6fa88b62-3a77-4dc3-a69c-607dbedb442c" targetNamespace="http://schemas.microsoft.com/office/2006/metadata/properties" ma:root="true" ma:fieldsID="0995c2b2f5d9ceb3dab1e821b96ddded" ns2:_="" ns3:_="">
     <xsd:import namespace="336891e5-a8e3-4741-8dd3-dc88c7bdbb7b"/>
@@ -4369,7 +4092,7 @@
 </ct:contentTypeSchema>
 </file>
 
-<file path=customXml/item4.xml><?xml version="1.0" encoding="utf-8"?>
+<file path=customXml/item2.xml><?xml version="1.0" encoding="utf-8"?>
 <p:properties xmlns:p="http://schemas.microsoft.com/office/2006/metadata/properties" xmlns:xsi="http://www.w3.org/2001/XMLSchema-instance" xmlns:pc="http://schemas.microsoft.com/office/infopath/2007/PartnerControls">
   <documentManagement>
     <TaxCatchAll xmlns="6fa88b62-3a77-4dc3-a69c-607dbedb442c" xsi:nil="true"/>
@@ -4384,23 +4107,20 @@
 </p:properties>
 </file>
 
-<file path=customXml/itemProps1.xml><?xml version="1.0" encoding="utf-8"?>
-<ds:datastoreItem xmlns:ds="http://schemas.openxmlformats.org/officeDocument/2006/customXml" ds:itemID="{CB6193E3-C94A-4DE5-8A92-62AC73B3A664}">
-  <ds:schemaRefs>
-    <ds:schemaRef ds:uri="http://schemas.openxmlformats.org/officeDocument/2006/bibliography"/>
-  </ds:schemaRefs>
-</ds:datastoreItem>
+<file path=customXml/item3.xml><?xml version="1.0" encoding="utf-8"?>
+<b:Sources xmlns:b="http://schemas.openxmlformats.org/officeDocument/2006/bibliography" xmlns="http://schemas.openxmlformats.org/officeDocument/2006/bibliography" SelectedStyle="\APASixthEditionOfficeOnline.xsl" StyleName="APA" Version="6"/>
 </file>
 
-<file path=customXml/itemProps2.xml><?xml version="1.0" encoding="utf-8"?>
-<ds:datastoreItem xmlns:ds="http://schemas.openxmlformats.org/officeDocument/2006/customXml" ds:itemID="{54A0DE3F-5DAB-4ABA-A79D-5610182EC747}">
-  <ds:schemaRefs>
-    <ds:schemaRef ds:uri="http://schemas.microsoft.com/sharepoint/v3/contenttype/forms"/>
-  </ds:schemaRefs>
-</ds:datastoreItem>
+<file path=customXml/item4.xml><?xml version="1.0" encoding="utf-8"?>
+<?mso-contentType ?>
+<FormTemplates xmlns="http://schemas.microsoft.com/sharepoint/v3/contenttype/forms">
+  <Display>DocumentLibraryForm</Display>
+  <Edit>DocumentLibraryForm</Edit>
+  <New>DocumentLibraryForm</New>
+</FormTemplates>
 </file>
 
-<file path=customXml/itemProps3.xml><?xml version="1.0" encoding="utf-8"?>
+<file path=customXml/itemProps1.xml><?xml version="1.0" encoding="utf-8"?>
 <ds:datastoreItem xmlns:ds="http://schemas.openxmlformats.org/officeDocument/2006/customXml" ds:itemID="{F77777D9-B324-4B14-A6CB-27C0E3BDFA7E}">
   <ds:schemaRefs>
     <ds:schemaRef ds:uri="http://schemas.microsoft.com/office/2006/metadata/contentType"/>
@@ -4419,7 +4139,7 @@
 </ds:datastoreItem>
 </file>
 
-<file path=customXml/itemProps4.xml><?xml version="1.0" encoding="utf-8"?>
+<file path=customXml/itemProps2.xml><?xml version="1.0" encoding="utf-8"?>
 <ds:datastoreItem xmlns:ds="http://schemas.openxmlformats.org/officeDocument/2006/customXml" ds:itemID="{E0AFCE62-E96B-4ECE-AC97-4DAAFB82FF0D}">
   <ds:schemaRefs>
     <ds:schemaRef ds:uri="http://schemas.microsoft.com/office/2006/metadata/properties"/>
@@ -4428,4 +4148,20 @@
     <ds:schemaRef ds:uri="336891e5-a8e3-4741-8dd3-dc88c7bdbb7b"/>
   </ds:schemaRefs>
 </ds:datastoreItem>
+</file>
+
+<file path=customXml/itemProps3.xml><?xml version="1.0" encoding="utf-8"?>
+<ds:datastoreItem xmlns:ds="http://schemas.openxmlformats.org/officeDocument/2006/customXml" ds:itemID="{CB6193E3-C94A-4DE5-8A92-62AC73B3A664}">
+  <ds:schemaRefs>
+    <ds:schemaRef ds:uri="http://schemas.openxmlformats.org/officeDocument/2006/bibliography"/>
+  </ds:schemaRefs>
+</ds:datastoreItem>
+</file>
+
+<file path=customXml/itemProps4.xml><?xml version="1.0" encoding="utf-8"?>
+<ds:datastoreItem xmlns:ds="http://schemas.openxmlformats.org/officeDocument/2006/customXml" ds:itemID="{54A0DE3F-5DAB-4ABA-A79D-5610182EC747}">
+  <ds:schemaRefs>
+    <ds:schemaRef ds:uri="http://schemas.microsoft.com/sharepoint/v3/contenttype/forms"/>
+  </ds:schemaRefs>
+</ds:datastoreItem>
 </file>
</xml_diff>

<commit_message>
update docx template after refactor and inclusion of monthly reports
</commit_message>
<xml_diff>
--- a/trafik_info_template.docx
+++ b/trafik_info_template.docx
@@ -21,15 +21,14 @@
           <w:rFonts w:ascii="Arial Black" w:hAnsi="Arial Black"/>
           <w:sz w:val="32"/>
         </w:rPr>
-        <w:t xml:space="preserve">RAFIK-INFO – UGE </w:t>
-      </w:r>
-      <w:proofErr w:type="gramStart"/>
+        <w:t xml:space="preserve">RAFIK-INFO – </w:t>
+      </w:r>
       <w:r>
         <w:rPr>
           <w:rFonts w:ascii="Arial Black" w:hAnsi="Arial Black"/>
           <w:sz w:val="32"/>
         </w:rPr>
-        <w:t xml:space="preserve">{{ </w:t>
+        <w:t>{{</w:t>
       </w:r>
       <w:proofErr w:type="spellStart"/>
       <w:r>
@@ -37,41 +36,37 @@
           <w:rFonts w:ascii="Arial Black" w:hAnsi="Arial Black"/>
           <w:sz w:val="32"/>
         </w:rPr>
-        <w:t>week</w:t>
-      </w:r>
-      <w:proofErr w:type="gramEnd"/>
+        <w:t>doc</w:t>
+      </w:r>
       <w:r>
         <w:rPr>
           <w:rFonts w:ascii="Arial Black" w:hAnsi="Arial Black"/>
           <w:sz w:val="32"/>
         </w:rPr>
-        <w:t>_</w:t>
-      </w:r>
-      <w:proofErr w:type="gramStart"/>
+        <w:t>ument</w:t>
+      </w:r>
       <w:r>
         <w:rPr>
           <w:rFonts w:ascii="Arial Black" w:hAnsi="Arial Black"/>
           <w:sz w:val="32"/>
         </w:rPr>
-        <w:t>number</w:t>
-      </w:r>
-      <w:proofErr w:type="spellEnd"/>
+        <w:t>_</w:t>
+      </w:r>
       <w:r>
         <w:rPr>
           <w:rFonts w:ascii="Arial Black" w:hAnsi="Arial Black"/>
           <w:sz w:val="32"/>
         </w:rPr>
-        <w:t xml:space="preserve"> }</w:t>
-      </w:r>
-      <w:proofErr w:type="gramEnd"/>
+        <w:t>type</w:t>
+      </w:r>
+      <w:proofErr w:type="spellEnd"/>
       <w:r>
         <w:rPr>
           <w:rFonts w:ascii="Arial Black" w:hAnsi="Arial Black"/>
           <w:sz w:val="32"/>
         </w:rPr>
-        <w:t xml:space="preserve">} </w:t>
-      </w:r>
-      <w:proofErr w:type="gramStart"/>
+        <w:t xml:space="preserve">}} </w:t>
+      </w:r>
       <w:r>
         <w:rPr>
           <w:rFonts w:ascii="Arial Black" w:hAnsi="Arial Black"/>
@@ -85,39 +80,15 @@
           <w:rFonts w:ascii="Arial Black" w:hAnsi="Arial Black"/>
           <w:sz w:val="32"/>
         </w:rPr>
-        <w:t>current</w:t>
-      </w:r>
-      <w:proofErr w:type="gramEnd"/>
+        <w:t>current_year</w:t>
+      </w:r>
+      <w:proofErr w:type="spellEnd"/>
       <w:r>
         <w:rPr>
           <w:rFonts w:ascii="Arial Black" w:hAnsi="Arial Black"/>
           <w:sz w:val="32"/>
         </w:rPr>
-        <w:t>_</w:t>
-      </w:r>
-      <w:proofErr w:type="gramStart"/>
-      <w:r>
-        <w:rPr>
-          <w:rFonts w:ascii="Arial Black" w:hAnsi="Arial Black"/>
-          <w:sz w:val="32"/>
-        </w:rPr>
-        <w:t>year</w:t>
-      </w:r>
-      <w:proofErr w:type="spellEnd"/>
-      <w:r>
-        <w:rPr>
-          <w:rFonts w:ascii="Arial Black" w:hAnsi="Arial Black"/>
-          <w:sz w:val="32"/>
-        </w:rPr>
-        <w:t xml:space="preserve"> }</w:t>
-      </w:r>
-      <w:proofErr w:type="gramEnd"/>
-      <w:r>
-        <w:rPr>
-          <w:rFonts w:ascii="Arial Black" w:hAnsi="Arial Black"/>
-          <w:sz w:val="32"/>
-        </w:rPr>
-        <w:t>}</w:t>
+        <w:t xml:space="preserve"> }}</w:t>
       </w:r>
     </w:p>
     <w:p>
@@ -131,6 +102,7 @@
       </w:pPr>
       <w:r>
         <w:rPr>
+          <w:noProof/>
           <w:lang w:eastAsia="da-DK"/>
         </w:rPr>
         <w:drawing>
@@ -999,6 +971,7 @@
       </w:pPr>
       <w:r>
         <w:rPr>
+          <w:noProof/>
           <w:lang w:eastAsia="da-DK"/>
         </w:rPr>
         <mc:AlternateContent>
@@ -4093,6 +4066,19 @@
 </file>
 
 <file path=customXml/item2.xml><?xml version="1.0" encoding="utf-8"?>
+<?mso-contentType ?>
+<FormTemplates xmlns="http://schemas.microsoft.com/sharepoint/v3/contenttype/forms">
+  <Display>DocumentLibraryForm</Display>
+  <Edit>DocumentLibraryForm</Edit>
+  <New>DocumentLibraryForm</New>
+</FormTemplates>
+</file>
+
+<file path=customXml/item3.xml><?xml version="1.0" encoding="utf-8"?>
+<b:Sources xmlns:b="http://schemas.openxmlformats.org/officeDocument/2006/bibliography" xmlns="http://schemas.openxmlformats.org/officeDocument/2006/bibliography" SelectedStyle="\APASixthEditionOfficeOnline.xsl" StyleName="APA" Version="6"/>
+</file>
+
+<file path=customXml/item4.xml><?xml version="1.0" encoding="utf-8"?>
 <p:properties xmlns:p="http://schemas.microsoft.com/office/2006/metadata/properties" xmlns:xsi="http://www.w3.org/2001/XMLSchema-instance" xmlns:pc="http://schemas.microsoft.com/office/infopath/2007/PartnerControls">
   <documentManagement>
     <TaxCatchAll xmlns="6fa88b62-3a77-4dc3-a69c-607dbedb442c" xsi:nil="true"/>
@@ -4105,19 +4091,6 @@
     <Seneste_Journalisering_SBSYSJournalisering xmlns="336891e5-a8e3-4741-8dd3-dc88c7bdbb7b" xsi:nil="true"/>
   </documentManagement>
 </p:properties>
-</file>
-
-<file path=customXml/item3.xml><?xml version="1.0" encoding="utf-8"?>
-<b:Sources xmlns:b="http://schemas.openxmlformats.org/officeDocument/2006/bibliography" xmlns="http://schemas.openxmlformats.org/officeDocument/2006/bibliography" SelectedStyle="\APASixthEditionOfficeOnline.xsl" StyleName="APA" Version="6"/>
-</file>
-
-<file path=customXml/item4.xml><?xml version="1.0" encoding="utf-8"?>
-<?mso-contentType ?>
-<FormTemplates xmlns="http://schemas.microsoft.com/sharepoint/v3/contenttype/forms">
-  <Display>DocumentLibraryForm</Display>
-  <Edit>DocumentLibraryForm</Edit>
-  <New>DocumentLibraryForm</New>
-</FormTemplates>
 </file>
 
 <file path=customXml/itemProps1.xml><?xml version="1.0" encoding="utf-8"?>
@@ -4140,12 +4113,9 @@
 </file>
 
 <file path=customXml/itemProps2.xml><?xml version="1.0" encoding="utf-8"?>
-<ds:datastoreItem xmlns:ds="http://schemas.openxmlformats.org/officeDocument/2006/customXml" ds:itemID="{E0AFCE62-E96B-4ECE-AC97-4DAAFB82FF0D}">
+<ds:datastoreItem xmlns:ds="http://schemas.openxmlformats.org/officeDocument/2006/customXml" ds:itemID="{54A0DE3F-5DAB-4ABA-A79D-5610182EC747}">
   <ds:schemaRefs>
-    <ds:schemaRef ds:uri="http://schemas.microsoft.com/office/2006/metadata/properties"/>
-    <ds:schemaRef ds:uri="http://schemas.microsoft.com/office/infopath/2007/PartnerControls"/>
-    <ds:schemaRef ds:uri="6fa88b62-3a77-4dc3-a69c-607dbedb442c"/>
-    <ds:schemaRef ds:uri="336891e5-a8e3-4741-8dd3-dc88c7bdbb7b"/>
+    <ds:schemaRef ds:uri="http://schemas.microsoft.com/sharepoint/v3/contenttype/forms"/>
   </ds:schemaRefs>
 </ds:datastoreItem>
 </file>
@@ -4159,9 +4129,12 @@
 </file>
 
 <file path=customXml/itemProps4.xml><?xml version="1.0" encoding="utf-8"?>
-<ds:datastoreItem xmlns:ds="http://schemas.openxmlformats.org/officeDocument/2006/customXml" ds:itemID="{54A0DE3F-5DAB-4ABA-A79D-5610182EC747}">
+<ds:datastoreItem xmlns:ds="http://schemas.openxmlformats.org/officeDocument/2006/customXml" ds:itemID="{E0AFCE62-E96B-4ECE-AC97-4DAAFB82FF0D}">
   <ds:schemaRefs>
-    <ds:schemaRef ds:uri="http://schemas.microsoft.com/sharepoint/v3/contenttype/forms"/>
+    <ds:schemaRef ds:uri="http://schemas.microsoft.com/office/2006/metadata/properties"/>
+    <ds:schemaRef ds:uri="http://schemas.microsoft.com/office/infopath/2007/PartnerControls"/>
+    <ds:schemaRef ds:uri="6fa88b62-3a77-4dc3-a69c-607dbedb442c"/>
+    <ds:schemaRef ds:uri="336891e5-a8e3-4741-8dd3-dc88c7bdbb7b"/>
   </ds:schemaRefs>
 </ds:datastoreItem>
 </file>
</xml_diff>